<commit_message>
improve agent prompt + fill template edge case
</commit_message>
<xml_diff>
--- a/app/data/test_filled_prior_authorization.docx
+++ b/app/data/test_filled_prior_authorization.docx
@@ -1521,7 +1521,9 @@
                 <w:sz w:val="20"/>
                 <w:szCs w:val="20"/>
               </w:rPr>
-              <w:t>Last</w:t>
+              <w:t>Last Name: Smith</w:t>
+              <w:tab/>
+              <w:t>First Name: John A.</w:t>
             </w:r>
             <w:r>
               <w:rPr>
@@ -1531,7 +1533,6 @@
                 <w:sz w:val="20"/>
                 <w:szCs w:val="20"/>
               </w:rPr>
-              <w:t xml:space="preserve"> </w:t>
             </w:r>
             <w:r>
               <w:rPr>
@@ -1541,7 +1542,6 @@
                 <w:sz w:val="20"/>
                 <w:szCs w:val="20"/>
               </w:rPr>
-              <w:t>Name: {</w:t>
             </w:r>
             <w:r>
               <w:rPr>
@@ -1551,7 +1551,6 @@
                 <w:sz w:val="20"/>
                 <w:szCs w:val="20"/>
               </w:rPr>
-              <w:t>{</w:t>
             </w:r>
             <w:r>
               <w:rPr>
@@ -1561,7 +1560,6 @@
                 <w:sz w:val="20"/>
                 <w:szCs w:val="20"/>
               </w:rPr>
-              <w:t>member_</w:t>
             </w:r>
             <w:r>
               <w:rPr>
@@ -1571,7 +1569,6 @@
                 <w:sz w:val="20"/>
                 <w:szCs w:val="20"/>
               </w:rPr>
-              <w:t>last_name</w:t>
             </w:r>
             <w:r>
               <w:rPr>
@@ -1581,7 +1578,6 @@
                 <w:sz w:val="20"/>
                 <w:szCs w:val="20"/>
               </w:rPr>
-              <w:t>}</w:t>
             </w:r>
             <w:r>
               <w:rPr>
@@ -1591,14 +1587,12 @@
                 <w:sz w:val="20"/>
                 <w:szCs w:val="20"/>
               </w:rPr>
-              <w:t>}</w:t>
-            </w:r>
-            <w:r>
-              <w:rPr>
-                <w:b/>
-                <w:sz w:val="20"/>
-              </w:rPr>
-              <w:tab/>
+            </w:r>
+            <w:r>
+              <w:rPr>
+                <w:b/>
+                <w:sz w:val="20"/>
+              </w:rPr>
             </w:r>
             <w:r>
               <w:rPr>
@@ -1607,7 +1601,6 @@
                 <w:sz w:val="20"/>
                 <w:szCs w:val="20"/>
               </w:rPr>
-              <w:t>First</w:t>
             </w:r>
             <w:r>
               <w:rPr>
@@ -1617,7 +1610,6 @@
                 <w:sz w:val="20"/>
                 <w:szCs w:val="20"/>
               </w:rPr>
-              <w:t xml:space="preserve"> </w:t>
             </w:r>
             <w:r>
               <w:rPr>
@@ -1627,7 +1619,6 @@
                 <w:sz w:val="20"/>
                 <w:szCs w:val="20"/>
               </w:rPr>
-              <w:t>Name: {</w:t>
             </w:r>
             <w:r>
               <w:rPr>
@@ -1637,7 +1628,6 @@
                 <w:sz w:val="20"/>
                 <w:szCs w:val="20"/>
               </w:rPr>
-              <w:t>{</w:t>
             </w:r>
             <w:r>
               <w:rPr>
@@ -1647,7 +1637,6 @@
                 <w:sz w:val="20"/>
                 <w:szCs w:val="20"/>
               </w:rPr>
-              <w:t>member_</w:t>
             </w:r>
             <w:r>
               <w:rPr>
@@ -1657,7 +1646,6 @@
                 <w:sz w:val="20"/>
                 <w:szCs w:val="20"/>
               </w:rPr>
-              <w:t>first_name}</w:t>
             </w:r>
             <w:r>
               <w:rPr>
@@ -1667,7 +1655,6 @@
                 <w:sz w:val="20"/>
                 <w:szCs w:val="20"/>
               </w:rPr>
-              <w:t>}</w:t>
             </w:r>
           </w:p>
         </w:tc>
@@ -1704,7 +1691,7 @@
                 <w:sz w:val="20"/>
                 <w:szCs w:val="20"/>
               </w:rPr>
-              <w:t>ID</w:t>
+              <w:t xml:space="preserve">ID # A </w:t>
             </w:r>
             <w:r>
               <w:rPr>
@@ -1714,7 +1701,6 @@
                 <w:sz w:val="20"/>
                 <w:szCs w:val="20"/>
               </w:rPr>
-              <w:t xml:space="preserve"> </w:t>
             </w:r>
             <w:r>
               <w:rPr>
@@ -1723,7 +1709,6 @@
                 <w:sz w:val="20"/>
                 <w:szCs w:val="20"/>
               </w:rPr>
-              <w:t xml:space="preserve"># </w:t>
             </w:r>
             <w:r>
               <w:rPr>
@@ -1733,7 +1718,6 @@
                 <w:sz w:val="20"/>
                 <w:szCs w:val="20"/>
               </w:rPr>
-              <w:t>A</w:t>
             </w:r>
             <w:r>
               <w:rPr>
@@ -1743,7 +1727,6 @@
                 <w:sz w:val="20"/>
                 <w:szCs w:val="20"/>
               </w:rPr>
-              <w:t xml:space="preserve"> BC123456789</w:t>
             </w:r>
           </w:p>
         </w:tc>
@@ -1773,7 +1756,7 @@
                 <w:sz w:val="20"/>
                 <w:szCs w:val="20"/>
               </w:rPr>
-              <w:t>Date</w:t>
+              <w:t>Date of Birth 1972-03-14</w:t>
             </w:r>
             <w:r>
               <w:rPr>
@@ -1781,14 +1764,12 @@
                 <w:sz w:val="20"/>
                 <w:szCs w:val="20"/>
               </w:rPr>
-              <w:t xml:space="preserve"> </w:t>
-            </w:r>
-            <w:r>
-              <w:rPr>
-                <w:sz w:val="20"/>
-                <w:szCs w:val="20"/>
-              </w:rPr>
-              <w:t>of</w:t>
+            </w:r>
+            <w:r>
+              <w:rPr>
+                <w:sz w:val="20"/>
+                <w:szCs w:val="20"/>
+              </w:rPr>
             </w:r>
             <w:r>
               <w:rPr>
@@ -1796,7 +1777,6 @@
                 <w:sz w:val="20"/>
                 <w:szCs w:val="20"/>
               </w:rPr>
-              <w:t xml:space="preserve"> </w:t>
             </w:r>
             <w:r>
               <w:rPr>
@@ -1804,7 +1784,6 @@
                 <w:sz w:val="20"/>
                 <w:szCs w:val="20"/>
               </w:rPr>
-              <w:t>Birth {</w:t>
             </w:r>
             <w:r>
               <w:rPr>
@@ -1812,7 +1791,6 @@
                 <w:sz w:val="20"/>
                 <w:szCs w:val="20"/>
               </w:rPr>
-              <w:t>{</w:t>
             </w:r>
             <w:r>
               <w:rPr>
@@ -1820,21 +1798,18 @@
                 <w:sz w:val="20"/>
                 <w:szCs w:val="20"/>
               </w:rPr>
-              <w:t>d</w:t>
-            </w:r>
-            <w:r>
-              <w:rPr>
-                <w:sz w:val="20"/>
-                <w:szCs w:val="20"/>
-              </w:rPr>
-              <w:t>ate_of_birth</w:t>
-            </w:r>
-            <w:r>
-              <w:rPr>
-                <w:sz w:val="20"/>
-                <w:szCs w:val="20"/>
-              </w:rPr>
-              <w:t>}</w:t>
+            </w:r>
+            <w:r>
+              <w:rPr>
+                <w:sz w:val="20"/>
+                <w:szCs w:val="20"/>
+              </w:rPr>
+            </w:r>
+            <w:r>
+              <w:rPr>
+                <w:sz w:val="20"/>
+                <w:szCs w:val="20"/>
+              </w:rPr>
             </w:r>
             <w:r>
               <w:rPr>
@@ -1842,7 +1817,6 @@
                 <w:sz w:val="20"/>
                 <w:szCs w:val="20"/>
               </w:rPr>
-              <w:t>}</w:t>
             </w:r>
           </w:p>
         </w:tc>
@@ -2130,7 +2104,7 @@
                 <w:sz w:val="20"/>
                 <w:szCs w:val="20"/>
               </w:rPr>
-              <w:t>Dr. Emily Carter, MD</w:t>
+              <w:t>Emily Carter</w:t>
             </w:r>
             <w:r>
               <w:rPr>
@@ -2252,7 +2226,6 @@
                 <w:sz w:val="20"/>
                 <w:szCs w:val="20"/>
               </w:rPr>
-              <w:t>TAX-987654</w:t>
             </w:r>
             <w:r>
               <w:rPr>
@@ -2307,7 +2280,6 @@
                 <w:sz w:val="20"/>
                 <w:szCs w:val="20"/>
               </w:rPr>
-              <w:t>1234567890</w:t>
             </w:r>
           </w:p>
         </w:tc>
@@ -2358,7 +2330,6 @@
                 <w:sz w:val="20"/>
                 <w:szCs w:val="20"/>
               </w:rPr>
-              <w:t>(555) 123-4567</w:t>
             </w:r>
             <w:r>
               <w:rPr>
@@ -2419,7 +2390,6 @@
                 <w:sz w:val="20"/>
                 <w:szCs w:val="20"/>
               </w:rPr>
-              <w:t>(555) 123-4568</w:t>
             </w:r>
           </w:p>
         </w:tc>
@@ -2482,7 +2452,6 @@
                 <w:sz w:val="20"/>
                 <w:szCs w:val="20"/>
               </w:rPr>
-              <w:t>Jane Doe</w:t>
             </w:r>
             <w:r>
               <w:rPr>
@@ -3183,7 +3152,6 @@
                 <w:sz w:val="20"/>
                 <w:szCs w:val="20"/>
               </w:rPr>
-              <w:t>9876543210</w:t>
             </w:r>
             <w:r>
               <w:rPr>
@@ -3246,7 +3214,6 @@
                 <w:sz w:val="20"/>
                 <w:szCs w:val="20"/>
               </w:rPr>
-              <w:t>(555) 987-6543</w:t>
             </w:r>
             <w:r>
               <w:rPr>
@@ -3308,7 +3275,6 @@
                 <w:sz w:val="20"/>
                 <w:szCs w:val="20"/>
               </w:rPr>
-              <w:t>(555) 987-6544</w:t>
             </w:r>
             <w:r>
               <w:rPr>
@@ -3384,7 +3350,6 @@
                 <w:sz w:val="20"/>
                 <w:szCs w:val="20"/>
               </w:rPr>
-              <w:t>John Admin</w:t>
             </w:r>
             <w:r>
               <w:rPr>
@@ -4742,7 +4707,7 @@
                 <w:sz w:val="20"/>
                 <w:szCs w:val="20"/>
               </w:rPr>
-              <w:t>Code</w:t>
+              <w:t xml:space="preserve">Code </w:t>
             </w:r>
             <w:r>
               <w:rPr>
@@ -4750,7 +4715,6 @@
                 <w:sz w:val="20"/>
                 <w:szCs w:val="20"/>
               </w:rPr>
-              <w:t xml:space="preserve"> </w:t>
             </w:r>
             <w:r>
               <w:rPr>
@@ -4758,7 +4722,6 @@
                 <w:sz w:val="20"/>
                 <w:szCs w:val="20"/>
               </w:rPr>
-              <w:t>M54.16</w:t>
             </w:r>
             <w:r>
               <w:rPr>
@@ -4814,7 +4777,7 @@
                 <w:sz w:val="20"/>
                 <w:szCs w:val="20"/>
               </w:rPr>
-              <w:t>Code</w:t>
+              <w:t xml:space="preserve">Code </w:t>
             </w:r>
             <w:r>
               <w:rPr>
@@ -4822,14 +4785,12 @@
                 <w:sz w:val="20"/>
                 <w:szCs w:val="20"/>
               </w:rPr>
-              <w:t xml:space="preserve"> </w:t>
-            </w:r>
-            <w:r>
-              <w:rPr>
-                <w:sz w:val="20"/>
-                <w:szCs w:val="20"/>
-              </w:rPr>
-              <w:t>M99.23</w:t>
+            </w:r>
+            <w:r>
+              <w:rPr>
+                <w:sz w:val="20"/>
+                <w:szCs w:val="20"/>
+              </w:rPr>
             </w:r>
             <w:r>
               <w:rPr>
@@ -4872,7 +4833,7 @@
                 <w:sz w:val="20"/>
                 <w:szCs w:val="20"/>
               </w:rPr>
-              <w:t>Code</w:t>
+              <w:t xml:space="preserve">Code </w:t>
             </w:r>
             <w:r>
               <w:rPr>
@@ -4880,14 +4841,12 @@
                 <w:sz w:val="20"/>
                 <w:szCs w:val="20"/>
               </w:rPr>
-              <w:t xml:space="preserve"> </w:t>
-            </w:r>
-            <w:r>
-              <w:rPr>
-                <w:sz w:val="20"/>
-                <w:szCs w:val="20"/>
-              </w:rPr>
-              <w:t>M54.5</w:t>
+            </w:r>
+            <w:r>
+              <w:rPr>
+                <w:sz w:val="20"/>
+                <w:szCs w:val="20"/>
+              </w:rPr>
             </w:r>
             <w:r>
               <w:rPr>
@@ -4933,7 +4892,7 @@
                 <w:sz w:val="20"/>
                 <w:szCs w:val="20"/>
               </w:rPr>
-              <w:t>Description</w:t>
+              <w:t>Description Lumbar radiculopathy, left L5 distribution</w:t>
             </w:r>
             <w:r>
               <w:rPr>
@@ -4941,14 +4900,12 @@
                 <w:sz w:val="20"/>
                 <w:szCs w:val="20"/>
               </w:rPr>
-              <w:t xml:space="preserve"> </w:t>
-            </w:r>
-            <w:r>
-              <w:rPr>
-                <w:sz w:val="20"/>
-                <w:szCs w:val="20"/>
-              </w:rPr>
-              <w:t>Lumbar radiculopathy, left L5 distribution</w:t>
+            </w:r>
+            <w:r>
+              <w:rPr>
+                <w:sz w:val="20"/>
+                <w:szCs w:val="20"/>
+              </w:rPr>
             </w:r>
             <w:r>
               <w:rPr>
@@ -4991,7 +4948,7 @@
                 <w:sz w:val="20"/>
                 <w:szCs w:val="20"/>
               </w:rPr>
-              <w:t>Description</w:t>
+              <w:t>Description Severe lumbar foraminal stenosis at L4-L5</w:t>
             </w:r>
             <w:r>
               <w:rPr>
@@ -4999,14 +4956,12 @@
                 <w:sz w:val="20"/>
                 <w:szCs w:val="20"/>
               </w:rPr>
-              <w:t xml:space="preserve"> </w:t>
-            </w:r>
-            <w:r>
-              <w:rPr>
-                <w:sz w:val="20"/>
-                <w:szCs w:val="20"/>
-              </w:rPr>
-              <w:t>Severe lumbar foraminal stenosis at L4-L5</w:t>
+            </w:r>
+            <w:r>
+              <w:rPr>
+                <w:sz w:val="20"/>
+                <w:szCs w:val="20"/>
+              </w:rPr>
             </w:r>
             <w:r>
               <w:rPr>
@@ -5060,7 +5015,7 @@
                 <w:sz w:val="20"/>
                 <w:szCs w:val="20"/>
               </w:rPr>
-              <w:t>Description</w:t>
+              <w:t>Description Chronic low back pain refractory to conservative therapy</w:t>
             </w:r>
             <w:r>
               <w:rPr>
@@ -5068,14 +5023,12 @@
                 <w:sz w:val="20"/>
                 <w:szCs w:val="20"/>
               </w:rPr>
-              <w:t xml:space="preserve"> </w:t>
-            </w:r>
-            <w:r>
-              <w:rPr>
-                <w:sz w:val="20"/>
-                <w:szCs w:val="20"/>
-              </w:rPr>
-              <w:t>Chronic low back pain refractory to conservative therapy</w:t>
+            </w:r>
+            <w:r>
+              <w:rPr>
+                <w:sz w:val="20"/>
+                <w:szCs w:val="20"/>
+              </w:rPr>
             </w:r>
             <w:r>
               <w:rPr>
@@ -5245,7 +5198,7 @@
                 <w:sz w:val="20"/>
                 <w:szCs w:val="20"/>
               </w:rPr>
-              <w:t>Code</w:t>
+              <w:t xml:space="preserve">Code </w:t>
             </w:r>
             <w:r>
               <w:rPr>
@@ -5253,14 +5206,12 @@
                 <w:sz w:val="20"/>
                 <w:szCs w:val="20"/>
               </w:rPr>
-              <w:t xml:space="preserve"> </w:t>
-            </w:r>
-            <w:r>
-              <w:rPr>
-                <w:sz w:val="20"/>
-                <w:szCs w:val="20"/>
-              </w:rPr>
-              <w:t>62311</w:t>
+            </w:r>
+            <w:r>
+              <w:rPr>
+                <w:sz w:val="20"/>
+                <w:szCs w:val="20"/>
+              </w:rPr>
             </w:r>
             <w:r>
               <w:rPr>
@@ -5303,7 +5254,7 @@
                 <w:sz w:val="20"/>
                 <w:szCs w:val="20"/>
               </w:rPr>
-              <w:t>Description</w:t>
+              <w:t>Description lumbar epidural steroid injection under fluoroscopic guidance</w:t>
             </w:r>
             <w:r>
               <w:rPr>
@@ -5311,14 +5262,12 @@
                 <w:sz w:val="20"/>
                 <w:szCs w:val="20"/>
               </w:rPr>
-              <w:t xml:space="preserve"> </w:t>
-            </w:r>
-            <w:r>
-              <w:rPr>
-                <w:sz w:val="20"/>
-                <w:szCs w:val="20"/>
-              </w:rPr>
-              <w:t>Lumbar epidural steroid injection under fluoroscopic guidance</w:t>
+            </w:r>
+            <w:r>
+              <w:rPr>
+                <w:sz w:val="20"/>
+                <w:szCs w:val="20"/>
+              </w:rPr>
             </w:r>
             <w:r>
               <w:rPr>
@@ -5365,7 +5314,7 @@
                 <w:sz w:val="20"/>
                 <w:szCs w:val="20"/>
               </w:rPr>
-              <w:t>Code</w:t>
+              <w:t xml:space="preserve">Code </w:t>
             </w:r>
             <w:r>
               <w:rPr>
@@ -5373,7 +5322,6 @@
                 <w:sz w:val="20"/>
                 <w:szCs w:val="20"/>
               </w:rPr>
-              <w:t xml:space="preserve"> </w:t>
             </w:r>
             <w:r>
               <w:rPr>
@@ -5428,7 +5376,7 @@
                 <w:sz w:val="20"/>
                 <w:szCs w:val="20"/>
               </w:rPr>
-              <w:t>Description</w:t>
+              <w:t xml:space="preserve">Description </w:t>
             </w:r>
             <w:r>
               <w:rPr>
@@ -5436,7 +5384,6 @@
                 <w:sz w:val="20"/>
                 <w:szCs w:val="20"/>
               </w:rPr>
-              <w:t xml:space="preserve"> </w:t>
             </w:r>
             <w:r>
               <w:rPr>
@@ -5494,7 +5441,7 @@
                 <w:sz w:val="20"/>
                 <w:szCs w:val="20"/>
               </w:rPr>
-              <w:t>Code</w:t>
+              <w:t xml:space="preserve">Code </w:t>
             </w:r>
             <w:r>
               <w:rPr>
@@ -5502,7 +5449,6 @@
                 <w:sz w:val="20"/>
                 <w:szCs w:val="20"/>
               </w:rPr>
-              <w:t xml:space="preserve"> </w:t>
             </w:r>
             <w:r>
               <w:rPr>
@@ -5550,7 +5496,7 @@
                 <w:sz w:val="20"/>
                 <w:szCs w:val="20"/>
               </w:rPr>
-              <w:t>Description</w:t>
+              <w:t xml:space="preserve">Description </w:t>
             </w:r>
             <w:r>
               <w:rPr>
@@ -5558,7 +5504,6 @@
                 <w:sz w:val="20"/>
                 <w:szCs w:val="20"/>
               </w:rPr>
-              <w:t xml:space="preserve"> </w:t>
             </w:r>
             <w:r>
               <w:rPr>

</xml_diff>